<commit_message>
Drop shape #14 from the main results table
Section 6.2 already covers shape #14 in full, and its row in Table 5 carried
only dashes: with no runnable reference there is no accuracy verdict, no
baseline time and no speedup to report. Listing it beside thirteen shapes that
do have all three invited the row to be read as a failure rather than as a
shape the reference cannot execute at all.

The table now covers the 13 comparable shapes, and its caption says so and
points to Section 6.2 for #14. Mirrored in TECH_REPORT.md. Still 12 pages.
</commit_message>
<xml_diff>
--- a/TechJam2026_Problem3_Technical_Report.docx
+++ b/TechJam2026_Problem3_Technical_Report.docx
@@ -3903,120 +3903,6 @@
           </w:p>
         </w:tc>
       </w:tr>
-      <w:tr>
-        <w:tc>
-          <w:tcPr>
-            <w:tcW w:type="dxa" w:w="360"/>
-          </w:tcPr>
-          <w:p>
-            <w:r/>
-            <w:r>
-              <w:rPr>
-                <w:sz w:val="16"/>
-              </w:rPr>
-              <w:t>14</w:t>
-            </w:r>
-          </w:p>
-        </w:tc>
-        <w:tc>
-          <w:tcPr>
-            <w:tcW w:type="dxa" w:w="2520"/>
-          </w:tcPr>
-          <w:p>
-            <w:r/>
-            <w:r>
-              <w:rPr>
-                <w:sz w:val="16"/>
-              </w:rPr>
-              <w:t>32, 1024, 16, 100000, 2, 1024</w:t>
-            </w:r>
-          </w:p>
-        </w:tc>
-        <w:tc>
-          <w:tcPr>
-            <w:tcW w:type="dxa" w:w="648"/>
-          </w:tcPr>
-          <w:p>
-            <w:r/>
-            <w:r>
-              <w:rPr>
-                <w:sz w:val="16"/>
-              </w:rPr>
-              <w:t>n/a</w:t>
-            </w:r>
-          </w:p>
-        </w:tc>
-        <w:tc>
-          <w:tcPr>
-            <w:tcW w:type="dxa" w:w="936"/>
-          </w:tcPr>
-          <w:p>
-            <w:r/>
-            <w:r>
-              <w:rPr>
-                <w:sz w:val="16"/>
-              </w:rPr>
-              <w:t>—</w:t>
-            </w:r>
-          </w:p>
-        </w:tc>
-        <w:tc>
-          <w:tcPr>
-            <w:tcW w:type="dxa" w:w="864"/>
-          </w:tcPr>
-          <w:p>
-            <w:r/>
-            <w:r>
-              <w:rPr>
-                <w:sz w:val="16"/>
-              </w:rPr>
-              <w:t>—</w:t>
-            </w:r>
-          </w:p>
-        </w:tc>
-        <w:tc>
-          <w:tcPr>
-            <w:tcW w:type="dxa" w:w="792"/>
-          </w:tcPr>
-          <w:p>
-            <w:r/>
-            <w:r>
-              <w:rPr>
-                <w:sz w:val="16"/>
-              </w:rPr>
-              <w:t>—</w:t>
-            </w:r>
-          </w:p>
-        </w:tc>
-        <w:tc>
-          <w:tcPr>
-            <w:tcW w:type="dxa" w:w="1008"/>
-          </w:tcPr>
-          <w:p>
-            <w:r/>
-            <w:r>
-              <w:rPr>
-                <w:sz w:val="16"/>
-              </w:rPr>
-              <w:t>eager x32</w:t>
-            </w:r>
-          </w:p>
-        </w:tc>
-        <w:tc>
-          <w:tcPr>
-            <w:tcW w:type="dxa" w:w="1080"/>
-          </w:tcPr>
-          <w:p>
-            <w:r/>
-            <w:r>
-              <w:rPr>
-                <w:sz w:val="16"/>
-              </w:rPr>
-              <w:t>fp16</w:t>
-            </w:r>
-          </w:p>
-        </w:tc>
-      </w:tr>
     </w:tbl>
     <w:p>
       <w:pPr>
@@ -4033,7 +3919,7 @@
           <w:i/>
           <w:sz w:val="17"/>
         </w:rPr>
-        <w:t>Table 5: Full sweep. dtype float32, causal, padding_ratio 0.0. "graph" = CUDA-graph capture; xN = batch slice count.</w:t>
+        <w:t>Table 5: The 13 shapes with a runnable reference. dtype float32, causal, padding_ratio 0.0. "graph" = CUDA-graph capture; xN = batch slice count. Shape #14 has no reference to compare against and is reported separately in Section 6.2.</w:t>
       </w:r>
     </w:p>
     <w:p>

</xml_diff>

<commit_message>
Fix caption damage from the previous commit
The previous commit's scripted edit misfired twice. It replaced Figure 4's
caption with the tooling-table caption, leaving the fusion figure captionless and
producing a second "Table 7" -- the exact duplicate the review had reported
against an older export, reintroduced by the fix for it. It also left the tooling
table itself at six rows rather than the intended four, so the offsetting cut
never happened.

Repaired by hand rather than by script: Figure 4's caption restored, the tooling
table trimmed to four rows with VS Code, matplotlib and python-docx moved into
its caption.

Captions now run Table 1-7 and Figure 1-4 with no duplicates. Still 13 pages,
formatting unchanged.
</commit_message>
<xml_diff>
--- a/TechJam2026_Problem3_Technical_Report.docx
+++ b/TechJam2026_Problem3_Technical_Report.docx
@@ -4677,7 +4677,7 @@
           <w:i/>
           <w:sz w:val="17"/>
         </w:rPr>
-        <w:t>Table 7: Development tooling. Editing in VS Code; figures via matplotlib, and this report generated from a script so it rebuilds when a measurement changes.</w:t>
+        <w:t>Figure 4: Per-shape speedup attributable to the two fusions. The dashed line marks parity; every shape sits above it.</w:t>
       </w:r>
     </w:p>
     <w:p>
@@ -4898,7 +4898,7 @@
         </w:tc>
         <w:tc>
           <w:tcPr>
-            <w:tcW w:type="dxa" w:w="2016"/>
+            <w:tcW w:type="dxa" w:w="2160"/>
             <w:shd w:fill="E8EDF3"/>
           </w:tcPr>
           <w:p>
@@ -4914,7 +4914,7 @@
         </w:tc>
         <w:tc>
           <w:tcPr>
-            <w:tcW w:type="dxa" w:w="4320"/>
+            <w:tcW w:type="dxa" w:w="4176"/>
             <w:shd w:fill="E8EDF3"/>
           </w:tcPr>
           <w:p>
@@ -4946,7 +4946,7 @@
         </w:tc>
         <w:tc>
           <w:tcPr>
-            <w:tcW w:type="dxa" w:w="2016"/>
+            <w:tcW w:type="dxa" w:w="2160"/>
           </w:tcPr>
           <w:p>
             <w:r/>
@@ -4960,7 +4960,7 @@
         </w:tc>
         <w:tc>
           <w:tcPr>
-            <w:tcW w:type="dxa" w:w="4320"/>
+            <w:tcW w:type="dxa" w:w="4176"/>
           </w:tcPr>
           <w:p>
             <w:r/>
@@ -4984,57 +4984,13 @@
               <w:rPr>
                 <w:sz w:val="16"/>
               </w:rPr>
-              <w:t>VS Code</w:t>
-            </w:r>
-          </w:p>
-        </w:tc>
-        <w:tc>
-          <w:tcPr>
-            <w:tcW w:type="dxa" w:w="2016"/>
-          </w:tcPr>
-          <w:p>
-            <w:r/>
-            <w:r>
-              <w:rPr>
-                <w:sz w:val="16"/>
-              </w:rPr>
-              <w:t>-</w:t>
-            </w:r>
-          </w:p>
-        </w:tc>
-        <w:tc>
-          <w:tcPr>
-            <w:tcW w:type="dxa" w:w="4320"/>
-          </w:tcPr>
-          <w:p>
-            <w:r/>
-            <w:r>
-              <w:rPr>
-                <w:sz w:val="16"/>
-              </w:rPr>
-              <w:t>Editor; Claude Code ran as the integrated agent</w:t>
-            </w:r>
-          </w:p>
-        </w:tc>
-      </w:tr>
-      <w:tr>
-        <w:tc>
-          <w:tcPr>
-            <w:tcW w:type="dxa" w:w="1800"/>
-          </w:tcPr>
-          <w:p>
-            <w:r/>
-            <w:r>
-              <w:rPr>
-                <w:sz w:val="16"/>
-              </w:rPr>
               <w:t>PyTorch</w:t>
             </w:r>
           </w:p>
         </w:tc>
         <w:tc>
           <w:tcPr>
-            <w:tcW w:type="dxa" w:w="2016"/>
+            <w:tcW w:type="dxa" w:w="2160"/>
           </w:tcPr>
           <w:p>
             <w:r/>
@@ -5048,7 +5004,7 @@
         </w:tc>
         <w:tc>
           <w:tcPr>
-            <w:tcW w:type="dxa" w:w="4320"/>
+            <w:tcW w:type="dxa" w:w="4176"/>
           </w:tcPr>
           <w:p>
             <w:r/>
@@ -5078,7 +5034,7 @@
         </w:tc>
         <w:tc>
           <w:tcPr>
-            <w:tcW w:type="dxa" w:w="2016"/>
+            <w:tcW w:type="dxa" w:w="2160"/>
           </w:tcPr>
           <w:p>
             <w:r/>
@@ -5092,7 +5048,7 @@
         </w:tc>
         <w:tc>
           <w:tcPr>
-            <w:tcW w:type="dxa" w:w="4320"/>
+            <w:tcW w:type="dxa" w:w="4176"/>
           </w:tcPr>
           <w:p>
             <w:r/>
@@ -5122,7 +5078,7 @@
         </w:tc>
         <w:tc>
           <w:tcPr>
-            <w:tcW w:type="dxa" w:w="2016"/>
+            <w:tcW w:type="dxa" w:w="2160"/>
           </w:tcPr>
           <w:p>
             <w:r/>
@@ -5136,7 +5092,7 @@
         </w:tc>
         <w:tc>
           <w:tcPr>
-            <w:tcW w:type="dxa" w:w="4320"/>
+            <w:tcW w:type="dxa" w:w="4176"/>
           </w:tcPr>
           <w:p>
             <w:r/>
@@ -5145,50 +5101,6 @@
                 <w:sz w:val="16"/>
               </w:rPr>
               <w:t>Fused GEMM+GELU epilogue</w:t>
-            </w:r>
-          </w:p>
-        </w:tc>
-      </w:tr>
-      <w:tr>
-        <w:tc>
-          <w:tcPr>
-            <w:tcW w:type="dxa" w:w="1800"/>
-          </w:tcPr>
-          <w:p>
-            <w:r/>
-            <w:r>
-              <w:rPr>
-                <w:sz w:val="16"/>
-              </w:rPr>
-              <w:t>matplotlib / python-docx</w:t>
-            </w:r>
-          </w:p>
-        </w:tc>
-        <w:tc>
-          <w:tcPr>
-            <w:tcW w:type="dxa" w:w="2016"/>
-          </w:tcPr>
-          <w:p>
-            <w:r/>
-            <w:r>
-              <w:rPr>
-                <w:sz w:val="16"/>
-              </w:rPr>
-              <w:t>3.x / 1.x</w:t>
-            </w:r>
-          </w:p>
-        </w:tc>
-        <w:tc>
-          <w:tcPr>
-            <w:tcW w:type="dxa" w:w="4320"/>
-          </w:tcPr>
-          <w:p>
-            <w:r/>
-            <w:r>
-              <w:rPr>
-                <w:sz w:val="16"/>
-              </w:rPr>
-              <w:t>Figures, and this report - generated from a script so it rebuilds when a measurement changes</w:t>
             </w:r>
           </w:p>
         </w:tc>
@@ -5209,7 +5121,7 @@
           <w:i/>
           <w:sz w:val="17"/>
         </w:rPr>
-        <w:t>Table 7: Development tooling.</w:t>
+        <w:t>Table 7: Development tooling. Editing in VS Code; figures via matplotlib, and this report generated from a script so it rebuilds when a measurement changes.</w:t>
       </w:r>
     </w:p>
     <w:p>

</xml_diff>

<commit_message>
Fill the empty cells in the fusion ablation table
The Geometric mean row carried an em-dash in both millisecond columns, which
reads as missing data. It was deliberate -- averaging milliseconds across shapes
spanning 0.12 to 87 ms is meaningless -- but nothing in the table said so.

Replaced with two aggregate rows, so the cells carry real numbers and both
statistics the surrounding prose already discusses are visible:

  Total            79.406   109.389   1.38x
  Geometric mean   n/a      n/a       1.52x

Sums verified against the thirteen rows above them. "n/a" rather than a dash,
since it is a deliberate non-value, and the caption now says why the two
aggregates differ: the summed-time ratio is dominated by shape #6, which alone
is 80% of the total, while the geometric mean weights each shape equally.

This also puts the 1.38x figure in the table for the first time; it was quoted
in the prose with no visible derivation.

Still 13 pages, formatting unchanged.
</commit_message>
<xml_diff>
--- a/TechJam2026_Problem3_Technical_Report.docx
+++ b/TechJam2026_Problem3_Technical_Report.docx
@@ -5215,6 +5215,68 @@
                 <w:b/>
                 <w:sz w:val="16"/>
               </w:rPr>
+              <w:t>Total</w:t>
+            </w:r>
+          </w:p>
+        </w:tc>
+        <w:tc>
+          <w:tcPr>
+            <w:tcW w:type="dxa" w:w="2160"/>
+          </w:tcPr>
+          <w:p>
+            <w:r/>
+            <w:r>
+              <w:rPr>
+                <w:b/>
+                <w:sz w:val="16"/>
+              </w:rPr>
+              <w:t>79.406</w:t>
+            </w:r>
+          </w:p>
+        </w:tc>
+        <w:tc>
+          <w:tcPr>
+            <w:tcW w:type="dxa" w:w="2160"/>
+          </w:tcPr>
+          <w:p>
+            <w:r/>
+            <w:r>
+              <w:rPr>
+                <w:b/>
+                <w:sz w:val="16"/>
+              </w:rPr>
+              <w:t>109.389</w:t>
+            </w:r>
+          </w:p>
+        </w:tc>
+        <w:tc>
+          <w:tcPr>
+            <w:tcW w:type="dxa" w:w="1512"/>
+          </w:tcPr>
+          <w:p>
+            <w:r/>
+            <w:r>
+              <w:rPr>
+                <w:b/>
+                <w:sz w:val="16"/>
+              </w:rPr>
+              <w:t>1.38x</w:t>
+            </w:r>
+          </w:p>
+        </w:tc>
+      </w:tr>
+      <w:tr>
+        <w:tc>
+          <w:tcPr>
+            <w:tcW w:type="dxa" w:w="1656"/>
+          </w:tcPr>
+          <w:p>
+            <w:r/>
+            <w:r>
+              <w:rPr>
+                <w:b/>
+                <w:sz w:val="16"/>
+              </w:rPr>
               <w:t>Geometric mean</w:t>
             </w:r>
           </w:p>
@@ -5230,7 +5292,7 @@
                 <w:b/>
                 <w:sz w:val="16"/>
               </w:rPr>
-              <w:t>—</w:t>
+              <w:t>n/a</w:t>
             </w:r>
           </w:p>
         </w:tc>
@@ -5245,7 +5307,7 @@
                 <w:b/>
                 <w:sz w:val="16"/>
               </w:rPr>
-              <w:t>—</w:t>
+              <w:t>n/a</w:t>
             </w:r>
           </w:p>
         </w:tc>
@@ -5281,7 +5343,7 @@
           <w:i/>
           <w:sz w:val="17"/>
         </w:rPr>
-        <w:t>Table 6: Fusion ablation across all 13 comparable shapes. Accuracy PASS in every run of both configurations.</w:t>
+        <w:t>Table 6: Fusion ablation across all 13 comparable shapes. Accuracy PASS in every run of both configurations. The two aggregates differ because the summed-time ratio is dominated by shape #6, which alone is 80% of the total; the geometric mean weights each shape equally, so it has no meaningful millisecond total of its own.</w:t>
       </w:r>
     </w:p>
     <w:p>

</xml_diff>